<commit_message>
cover letter: drop suggested-reviewers placeholder (none to suggest)
</commit_message>
<xml_diff>
--- a/paper/cover_letter.docx
+++ b/paper/cover_letter.docx
@@ -536,32 +536,6 @@
       </w:r>
       <w:r>
         <w:t xml:space="preserve">Purdue University</w:t>
-      </w:r>
-    </w:p>
-    <w:p>
-      <w:pPr>
-        <w:pStyle w:val="BodyText"/>
-      </w:pPr>
-      <w:r>
-        <w:rPr>
-          <w:i/>
-          <w:iCs/>
-        </w:rPr>
-        <w:t xml:space="preserve">Suggested reviewers (optional — to complete if desired): researchers in anharmonic lattice</w:t>
-      </w:r>
-      <w:r>
-        <w:rPr>
-          <w:i/>
-          <w:iCs/>
-        </w:rPr>
-        <w:t xml:space="preserve"> </w:t>
-      </w:r>
-      <w:r>
-        <w:rPr>
-          <w:i/>
-          <w:iCs/>
-        </w:rPr>
-        <w:t xml:space="preserve">dynamics / SSCHA and in foundation-MLIP benchmarking.</w:t>
       </w:r>
     </w:p>
     <w:bookmarkEnd w:id="9"/>

</xml_diff>

<commit_message>
propagate multi-mode results into supplementary, cover letter and Zenodo metadata; record what moved and the two claims that did not survive (H2 leader example, T* ordering); update resume state
</commit_message>
<xml_diff>
--- a/paper/cover_letter.docx
+++ b/paper/cover_letter.docx
@@ -78,7 +78,7 @@
           <w:b/>
           <w:bCs/>
         </w:rPr>
-        <w:t xml:space="preserve">“Finite-temperature dynamic stability is a blind spot of</w:t>
+        <w:t xml:space="preserve">“Finite-temperature dynamic stability separates foundation</w:t>
       </w:r>
       <w:r>
         <w:rPr>
@@ -92,7 +92,7 @@
           <w:b/>
           <w:bCs/>
         </w:rPr>
-        <w:t xml:space="preserve">foundation machine-learning interatomic potentials”</w:t>
+        <w:t xml:space="preserve">machine-learning interatomic potentials that harmonic benchmarks rank equally”</w:t>
       </w:r>
       <w:r>
         <w:t xml:space="preserve"> </w:t>
@@ -217,13 +217,19 @@
         <w:t xml:space="preserve"> </w:t>
       </w:r>
       <w:r>
-        <w:t xml:space="preserve">wrong. Whether foundation MLIPs reproduce this harmonic → finite-temperature stabilisation has</w:t>
-      </w:r>
-      <w:r>
-        <w:t xml:space="preserve"> </w:t>
-      </w:r>
-      <w:r>
-        <w:t xml:space="preserve">been essentially un-benchmarked. This work closes that gap.</w:t>
+        <w:t xml:space="preserve">wrong. Two 2025 studies have probed finite-temperature reliability directly, but each is confined</w:t>
+      </w:r>
+      <w:r>
+        <w:t xml:space="preserve"> </w:t>
+      </w:r>
+      <w:r>
+        <w:t xml:space="preserve">to a single model family or a single system; whether the effect is architecture-general and</w:t>
+      </w:r>
+      <w:r>
+        <w:t xml:space="preserve"> </w:t>
+      </w:r>
+      <w:r>
+        <w:t xml:space="preserve">chemistry-general is untested. This work closes that gap.</w:t>
       </w:r>
     </w:p>
     <w:p>
@@ -303,25 +309,53 @@
         <w:t xml:space="preserve"> </w:t>
       </w:r>
       <w:r>
-        <w:t xml:space="preserve">We introduce a single-mode quantum self-consistent-harmonic</w:t>
-      </w:r>
-      <w:r>
-        <w:t xml:space="preserve"> </w:t>
-      </w:r>
-      <w:r>
-        <w:t xml:space="preserve">(</w:t>
-      </w:r>
-      <w:r>
-        <w:t xml:space="preserve">“soft-mode free energy”</w:t>
-      </w:r>
-      <w:r>
-        <w:t xml:space="preserve">) screen that resolves the harmonic → finite-T stabilisation at</w:t>
-      </w:r>
-      <w:r>
-        <w:t xml:space="preserve"> </w:t>
-      </w:r>
-      <w:r>
-        <w:t xml:space="preserve">sub-second CPU cost per temperature, validated against experimental transition temperatures.</w:t>
+        <w:t xml:space="preserve">We introduce a quantum self-consistent-harmonic (</w:t>
+      </w:r>
+      <w:r>
+        <w:t xml:space="preserve">“soft-mode free</w:t>
+      </w:r>
+      <w:r>
+        <w:t xml:space="preserve"> </w:t>
+      </w:r>
+      <w:r>
+        <w:t xml:space="preserve">energy”</w:t>
+      </w:r>
+      <w:r>
+        <w:t xml:space="preserve">) screen that evaluates</w:t>
+      </w:r>
+      <w:r>
+        <w:t xml:space="preserve"> </w:t>
+      </w:r>
+      <w:r>
+        <w:rPr>
+          <w:i/>
+          <w:iCs/>
+        </w:rPr>
+        <w:t xml:space="preserve">every</w:t>
+      </w:r>
+      <w:r>
+        <w:t xml:space="preserve"> </w:t>
+      </w:r>
+      <w:r>
+        <w:t xml:space="preserve">imaginary commensurate mode and calls the phase unstable</w:t>
+      </w:r>
+      <w:r>
+        <w:t xml:space="preserve"> </w:t>
+      </w:r>
+      <w:r>
+        <w:t xml:space="preserve">if any condenses, at sub-second CPU cost per temperature. The criterion matters: in SrTiO₃ the</w:t>
+      </w:r>
+      <w:r>
+        <w:t xml:space="preserve"> </w:t>
+      </w:r>
+      <w:r>
+        <w:t xml:space="preserve">Γ ferroelectric mode is deeper than the R-point tilt yet is quantum-suppressed, so a</w:t>
+      </w:r>
+      <w:r>
+        <w:t xml:space="preserve"> </w:t>
+      </w:r>
+      <w:r>
+        <w:t xml:space="preserve">softest-mode screen inspects the wrong instability.</w:t>
       </w:r>
     </w:p>
     <w:p>
@@ -361,7 +395,7 @@
         <w:t xml:space="preserve"> </w:t>
       </w:r>
       <w:r>
-        <w:t xml:space="preserve">deploy it, is itself a trap: it is clean for martensitic bcc metals but</w:t>
+        <w:t xml:space="preserve">deploy it, is clean for martensitic bcc metals but</w:t>
       </w:r>
       <w:r>
         <w:t xml:space="preserve"> </w:t>
@@ -371,39 +405,43 @@
           <w:i/>
           <w:iCs/>
         </w:rPr>
-        <w:t xml:space="preserve">systematically</w:t>
-      </w:r>
-      <w:r>
-        <w:rPr>
-          <w:i/>
-          <w:iCs/>
-        </w:rPr>
-        <w:t xml:space="preserve"> </w:t>
-      </w:r>
-      <w:r>
-        <w:rPr>
-          <w:i/>
-          <w:iCs/>
-        </w:rPr>
-        <w:t xml:space="preserve">false-stabilises</w:t>
-      </w:r>
-      <w:r>
-        <w:t xml:space="preserve"> </w:t>
-      </w:r>
-      <w:r>
-        <w:t xml:space="preserve">deep displacive (ferroelectric) instabilities — the regime that dominates</w:t>
-      </w:r>
-      <w:r>
-        <w:t xml:space="preserve"> </w:t>
-      </w:r>
-      <w:r>
-        <w:t xml:space="preserve">generative-CSP outputs — so the cheap screen is the more reliable indicator there. This inverts</w:t>
-      </w:r>
-      <w:r>
-        <w:t xml:space="preserve"> </w:t>
-      </w:r>
-      <w:r>
-        <w:t xml:space="preserve">the usual cost/accuracy intuition and reframes how such cross-checks should be used.</w:t>
+        <w:t xml:space="preserve">systematically false-stabilises</w:t>
+      </w:r>
+      <w:r>
+        <w:t xml:space="preserve"> </w:t>
+      </w:r>
+      <w:r>
+        <w:t xml:space="preserve">deep</w:t>
+      </w:r>
+      <w:r>
+        <w:t xml:space="preserve"> </w:t>
+      </w:r>
+      <w:r>
+        <w:t xml:space="preserve">displacive (ferroelectric) instabilities at its default fourth-order truncation — the regime that</w:t>
+      </w:r>
+      <w:r>
+        <w:t xml:space="preserve"> </w:t>
+      </w:r>
+      <w:r>
+        <w:t xml:space="preserve">dominates generative-CSP outputs. Theory predicts this truncation to fail for cubic metal halide</w:t>
+      </w:r>
+      <w:r>
+        <w:t xml:space="preserve"> </w:t>
+      </w:r>
+      <w:r>
+        <w:t xml:space="preserve">perovskites; we measure it at benchmark scale and show it extends to oxide perovskites and,</w:t>
+      </w:r>
+      <w:r>
+        <w:t xml:space="preserve"> </w:t>
+      </w:r>
+      <w:r>
+        <w:t xml:space="preserve">blow-up-free, to cubic fluorites. The cheap screen is the more reliable indicator there,</w:t>
+      </w:r>
+      <w:r>
+        <w:t xml:space="preserve"> </w:t>
+      </w:r>
+      <w:r>
+        <w:t xml:space="preserve">inverting the usual cost/accuracy intuition.</w:t>
       </w:r>
     </w:p>
     <w:p>

</xml_diff>